<commit_message>
Guides labelled by cloud: IMPLEMENTATION-GOV / IMPLEMENTATION-COMMERCIAL, Word headers per cloud
</commit_message>
<xml_diff>
--- a/docs/MLZ-Security-Lab-Implementation-Guide-Commercial.docx
+++ b/docs/MLZ-Security-Lab-Implementation-Guide-Commercial.docx
@@ -21,7 +21,7 @@
         </w:rPr>
         <w:t xml:space="preserve">Repository: </w:t>
       </w:r>
-      <w:hyperlink w:history="1" r:id="rIdh11cpysyg1yzckdp9easf">
+      <w:hyperlink w:history="1" r:id="rIdlss_-zso5311pjs_aq8sa">
         <w:r>
           <w:rPr>
             <w:rStyle w:val="Hyperlink"/>
@@ -103,7 +103,7 @@
           <w:sz w:val="18"/>
           <w:szCs w:val="18"/>
         </w:rPr>
-        <w:t xml:space="preserve">IMPLEMENTATION.md</w:t>
+        <w:t xml:space="preserve">IMPLEMENTATION-GOV.md</w:t>
       </w:r>
       <w:r>
         <w:t xml:space="preserve">). The kit is the same; the portal, the endpoints, the region choice, the VM sizes and several pitfalls are not, so the steps are written out in full here rather than as a list of differences.</w:t>
@@ -157,7 +157,7 @@
       <w:r>
         <w:t xml:space="preserve">Repository: </w:t>
       </w:r>
-      <w:hyperlink w:history="1" r:id="rIddzzk4ljbho1ugum8vt3t4">
+      <w:hyperlink w:history="1" r:id="rIdvqcwylulby4zkh1og0ykq">
         <w:r>
           <w:rPr>
             <w:rStyle w:val="Hyperlink"/>
@@ -3229,7 +3229,7 @@
       <w:r>
         <w:t xml:space="preserve">Open </w:t>
       </w:r>
-      <w:hyperlink w:history="1" r:id="rIdueiwgp88tl5ywsblzsagf">
+      <w:hyperlink w:history="1" r:id="rIdstgjhdsy1i63gvxz-8xsk">
         <w:r>
           <w:rPr>
             <w:rStyle w:val="Hyperlink"/>
@@ -11887,7 +11887,29 @@
         <w:t xml:space="preserve">Onboarded</w:t>
       </w:r>
       <w:r>
-        <w:t xml:space="preserve">, managed by Intune, two minutes later. The servers were already onboarded through Defender for Servers.</w:t>
+        <w:t xml:space="preserve">, managed by Intune, two minutes later. </w:t>
+      </w:r>
+      <w:r>
+        <w:rPr>
+          <w:rFonts w:ascii="Consolas" w:cs="Consolas" w:eastAsia="Consolas" w:hAnsi="Consolas"/>
+          <w:sz w:val="18"/>
+          <w:szCs w:val="18"/>
+        </w:rPr>
+        <w:t xml:space="preserve">lab-cl02</w:t>
+      </w:r>
+      <w:r>
+        <w:t xml:space="preserve"> and </w:t>
+      </w:r>
+      <w:r>
+        <w:rPr>
+          <w:rFonts w:ascii="Consolas" w:cs="Consolas" w:eastAsia="Consolas" w:hAnsi="Consolas"/>
+          <w:sz w:val="18"/>
+          <w:szCs w:val="18"/>
+        </w:rPr>
+        <w:t xml:space="preserve">lab-cl03</w:t>
+      </w:r>
+      <w:r>
+        <w:t xml:space="preserve"> followed with no further action after one lab-user sign-in each (MDM enrollment state 1 on both). The servers were already onboarded through Defender for Servers.</w:t>
       </w:r>
     </w:p>
     <w:p>
@@ -18079,7 +18101,7 @@
         <w:sz w:val="16"/>
         <w:szCs w:val="16"/>
       </w:rPr>
-      <w:t xml:space="preserve">MLZ Security Lab Starter Kit — Implementation Guide (Azure Government)</w:t>
+      <w:t xml:space="preserve">MLZ Security Lab Starter Kit — Implementation Guide (Azure Commercial)</w:t>
     </w:r>
   </w:p>
 </w:hdr>

</xml_diff>

<commit_message>
Detection test (Test-LabDetections.ps1), Linux hydration SSH attempt, guides section 6.6
</commit_message>
<xml_diff>
--- a/docs/MLZ-Security-Lab-Implementation-Guide-Commercial.docx
+++ b/docs/MLZ-Security-Lab-Implementation-Guide-Commercial.docx
@@ -21,7 +21,7 @@
         </w:rPr>
         <w:t xml:space="preserve">Repository: </w:t>
       </w:r>
-      <w:hyperlink w:history="1" r:id="rIdsykn_5692so8uciwto5qz">
+      <w:hyperlink w:history="1" r:id="rIdbzjzlmi1f3ghwyvxgibor">
         <w:r>
           <w:rPr>
             <w:rStyle w:val="Hyperlink"/>
@@ -136,7 +136,7 @@
         <w:t xml:space="preserve">contoso.onmicrosoft.com</w:t>
       </w:r>
       <w:r>
-        <w:t xml:space="preserve">) on 27 October 2026. The screenshots are from those runs. Three deployment runs were needed to shake out the Commercial-specific defects listed in section 8 (#48–#59); every fix is on </w:t>
+        <w:t xml:space="preserve">) on 27 October 2026. The screenshots are from those runs. Three deployment runs were needed to shake out the Commercial-specific defects listed in section 8 (#48–#63); every fix is on </w:t>
       </w:r>
       <w:r>
         <w:rPr>
@@ -157,7 +157,7 @@
       <w:r>
         <w:t xml:space="preserve">Repository: </w:t>
       </w:r>
-      <w:hyperlink w:history="1" r:id="rIddnoj6vgot6sntapehdber">
+      <w:hyperlink w:history="1" r:id="rId0xfa6wh964sqeufdhbqev">
         <w:r>
           <w:rPr>
             <w:rStyle w:val="Hyperlink"/>
@@ -3229,7 +3229,7 @@
       <w:r>
         <w:t xml:space="preserve">Open </w:t>
       </w:r>
-      <w:hyperlink w:history="1" r:id="rIdhml_-n-yrsqgqng3rr9om">
+      <w:hyperlink w:history="1" r:id="rIdo1hkxqqhfvd2uxu-wlcwd">
         <w:r>
           <w:rPr>
             <w:rStyle w:val="Hyperlink"/>
@@ -13329,7 +13329,33 @@
         <w:t xml:space="preserve">lab-hydrate</w:t>
       </w:r>
       <w:r>
-        <w:t xml:space="preserve"> timer on every Linux VM start during the deployment and run hourly. Section 6.5 shows how to confirm it is reaching the workspace.</w:t>
+        <w:t xml:space="preserve"> timer on every Linux VM start during the deployment and run hourly. Section 6.5 shows how to confirm it is reaching the workspace, and section 6.6 how to make the lab raise real alerts and incidents on demand (hydration itself is meant to stay below detection thresholds).</w:t>
+      </w:r>
+    </w:p>
+    <w:p>
+      <w:pPr>
+        <w:spacing w:after="120"/>
+      </w:pPr>
+      <w:r>
+        <w:rPr>
+          <w:b/>
+          <w:bCs/>
+        </w:rPr>
+        <w:t xml:space="preserve">Hydration only runs while the VMs are on.</w:t>
+      </w:r>
+      <w:r>
+        <w:t xml:space="preserve"> The kit gives every lab VM a DevTest auto-shutdown at 03:00 UTC (23:00 Eastern) and nothing starts them again, so after the first night the workspace goes quiet until someone starts the lab. Start it with </w:t>
+      </w:r>
+      <w:r>
+        <w:rPr>
+          <w:rFonts w:ascii="Consolas" w:cs="Consolas" w:eastAsia="Consolas" w:hAnsi="Consolas"/>
+          <w:sz w:val="18"/>
+          <w:szCs w:val="18"/>
+        </w:rPr>
+        <w:t xml:space="preserve">az vm start --ids $(az vm list -g &lt;tier3-rg&gt; --query "[].id" -o tsv)</w:t>
+      </w:r>
+      <w:r>
+        <w:t xml:space="preserve"> (the domain controller first, if you start them one by one); the next hourly run picks up from there.</w:t>
       </w:r>
     </w:p>
     <w:p>
@@ -14620,6 +14646,1648 @@
     </w:p>
     <w:p>
       <w:pPr>
+        <w:pStyle w:val="Heading2"/>
+      </w:pPr>
+      <w:r>
+        <w:t xml:space="preserve">6.6 Detection test — prove alerts and incidents fire</w:t>
+      </w:r>
+    </w:p>
+    <w:p>
+      <w:pPr>
+        <w:spacing w:after="120"/>
+      </w:pPr>
+      <w:r>
+        <w:t xml:space="preserve">Hydration (5.3) is background activity for hunting and is deliberately quiet: in normal operation it raises almost nothing. On the test lab the only incident traced to it was a one-off </w:t>
+      </w:r>
+      <w:r>
+        <w:rPr>
+          <w:i/>
+          <w:iCs/>
+        </w:rPr>
+        <w:t xml:space="preserve">AD user enabled and password not set within 48 hours</w:t>
+      </w:r>
+      <w:r>
+        <w:t xml:space="preserve">, raised when the domain controller's first hydration run created </w:t>
+      </w:r>
+      <w:r>
+        <w:rPr>
+          <w:rFonts w:ascii="Consolas" w:cs="Consolas" w:eastAsia="Consolas" w:hAnsi="Consolas"/>
+          <w:sz w:val="18"/>
+          <w:szCs w:val="18"/>
+        </w:rPr>
+        <w:t xml:space="preserve">lab.churn</w:t>
+      </w:r>
+      <w:r>
+        <w:t xml:space="preserve">. To prove the detection chain (VM → agent → workspace → analytics rule or Defender → incident), run the detection test from the same PowerShell Cloud Shell as step 5, with the VMs running:</w:t>
+      </w:r>
+    </w:p>
+    <w:p>
+      <w:pPr>
+        <w:keepNext/>
+        <w:shd w:fill="F2F2F2" w:color="auto" w:val="clear"/>
+        <w:spacing w:after="0" w:before="0" w:line="240"/>
+        <w:ind w:left="120" w:right="120"/>
+      </w:pPr>
+      <w:r>
+        <w:rPr>
+          <w:rFonts w:ascii="Consolas" w:cs="Consolas" w:eastAsia="Consolas" w:hAnsi="Consolas"/>
+          <w:sz w:val="17"/>
+          <w:szCs w:val="17"/>
+        </w:rPr>
+        <w:t xml:space="preserve">cd ~/kit/templates/scripts</w:t>
+      </w:r>
+    </w:p>
+    <w:p>
+      <w:pPr>
+        <w:keepNext/>
+        <w:shd w:fill="F2F2F2" w:color="auto" w:val="clear"/>
+        <w:spacing w:after="0" w:before="0" w:line="240"/>
+        <w:ind w:left="120" w:right="120"/>
+      </w:pPr>
+      <w:r>
+        <w:rPr>
+          <w:rFonts w:ascii="Consolas" w:cs="Consolas" w:eastAsia="Consolas" w:hAnsi="Consolas"/>
+          <w:sz w:val="17"/>
+          <w:szCs w:val="17"/>
+        </w:rPr>
+        <w:t xml:space="preserve">./Test-LabDetections.ps1 -SubscriptionId &lt;subscription-id&gt; -ResourceGroupName mca-dev-usw2-seclab-rg-network `</w:t>
+      </w:r>
+    </w:p>
+    <w:p>
+      <w:pPr>
+        <w:keepNext w:val="false"/>
+        <w:shd w:fill="F2F2F2" w:color="auto" w:val="clear"/>
+        <w:spacing w:after="160" w:before="0" w:line="240"/>
+        <w:ind w:left="120" w:right="120"/>
+      </w:pPr>
+      <w:r>
+        <w:rPr>
+          <w:rFonts w:ascii="Consolas" w:cs="Consolas" w:eastAsia="Consolas" w:hAnsi="Consolas"/>
+          <w:sz w:val="17"/>
+          <w:szCs w:val="17"/>
+        </w:rPr>
+        <w:t xml:space="preserve">  -WorkspaceName law-mca-lab -Cloud Global</w:t>
+      </w:r>
+    </w:p>
+    <w:p>
+      <w:pPr>
+        <w:spacing w:after="120"/>
+      </w:pPr>
+      <w:r>
+        <w:t xml:space="preserve">It runs ten safe, documented test actions through Run command and then lists, per test, the alert and incident each one raised. On the domain controller the AD changes are made by a temporary admin (</w:t>
+      </w:r>
+      <w:r>
+        <w:rPr>
+          <w:rFonts w:ascii="Consolas" w:cs="Consolas" w:eastAsia="Consolas" w:hAnsi="Consolas"/>
+          <w:sz w:val="18"/>
+          <w:szCs w:val="18"/>
+        </w:rPr>
+        <w:t xml:space="preserve">lab.detop</w:t>
+      </w:r>
+      <w:r>
+        <w:t xml:space="preserve">), because several rules ignore changes made by SYSTEM, which is what Run command runs as. That account and the disposable test user both get random passwords that never leave the DC, and both are deleted at the end.</w:t>
+      </w:r>
+    </w:p>
+    <w:tbl>
+      <w:tblPr>
+        <w:tblW w:type="dxa" w:w="10080"/>
+        <w:tblBorders>
+          <w:top w:val="single" w:color="auto" w:sz="4"/>
+          <w:left w:val="single" w:color="auto" w:sz="4"/>
+          <w:bottom w:val="single" w:color="auto" w:sz="4"/>
+          <w:right w:val="single" w:color="auto" w:sz="4"/>
+          <w:insideH w:val="single" w:color="auto" w:sz="4"/>
+          <w:insideV w:val="single" w:color="auto" w:sz="4"/>
+        </w:tblBorders>
+      </w:tblPr>
+      <w:tblGrid>
+        <w:gridCol w:w="500"/>
+        <w:gridCol w:w="2800"/>
+        <w:gridCol w:w="3800"/>
+        <w:gridCol w:w="2980"/>
+      </w:tblGrid>
+      <w:tr>
+        <w:trPr>
+          <w:tblHeader/>
+        </w:trPr>
+        <w:tc>
+          <w:tcPr>
+            <w:tcW w:type="dxa" w:w="0"/>
+            <w:shd w:fill="DCE6F1" w:color="auto" w:val="clear"/>
+            <w:tcMar>
+              <w:top w:type="dxa" w:w="60"/>
+              <w:left w:type="dxa" w:w="80"/>
+              <w:bottom w:type="dxa" w:w="60"/>
+              <w:right w:type="dxa" w:w="80"/>
+            </w:tcMar>
+          </w:tcPr>
+          <w:p>
+            <w:pPr>
+              <w:spacing w:after="0"/>
+            </w:pPr>
+            <w:r>
+              <w:rPr>
+                <w:b/>
+                <w:bCs/>
+                <w:sz w:val="18"/>
+                <w:szCs w:val="18"/>
+              </w:rPr>
+              <w:t xml:space="preserve">Test</w:t>
+            </w:r>
+          </w:p>
+        </w:tc>
+        <w:tc>
+          <w:tcPr>
+            <w:tcW w:type="dxa" w:w="0"/>
+            <w:shd w:fill="DCE6F1" w:color="auto" w:val="clear"/>
+            <w:tcMar>
+              <w:top w:type="dxa" w:w="60"/>
+              <w:left w:type="dxa" w:w="80"/>
+              <w:bottom w:type="dxa" w:w="60"/>
+              <w:right w:type="dxa" w:w="80"/>
+            </w:tcMar>
+          </w:tcPr>
+          <w:p>
+            <w:pPr>
+              <w:spacing w:after="0"/>
+            </w:pPr>
+            <w:r>
+              <w:rPr>
+                <w:b/>
+                <w:bCs/>
+                <w:sz w:val="18"/>
+                <w:szCs w:val="18"/>
+              </w:rPr>
+              <w:t xml:space="preserve">Action</w:t>
+            </w:r>
+          </w:p>
+        </w:tc>
+        <w:tc>
+          <w:tcPr>
+            <w:tcW w:type="dxa" w:w="0"/>
+            <w:shd w:fill="DCE6F1" w:color="auto" w:val="clear"/>
+            <w:tcMar>
+              <w:top w:type="dxa" w:w="60"/>
+              <w:left w:type="dxa" w:w="80"/>
+              <w:bottom w:type="dxa" w:w="60"/>
+              <w:right w:type="dxa" w:w="80"/>
+            </w:tcMar>
+          </w:tcPr>
+          <w:p>
+            <w:pPr>
+              <w:spacing w:after="0"/>
+            </w:pPr>
+            <w:r>
+              <w:rPr>
+                <w:b/>
+                <w:bCs/>
+                <w:sz w:val="18"/>
+                <w:szCs w:val="18"/>
+              </w:rPr>
+              <w:t xml:space="preserve">Expected Sentinel alert</w:t>
+            </w:r>
+          </w:p>
+        </w:tc>
+        <w:tc>
+          <w:tcPr>
+            <w:tcW w:type="dxa" w:w="0"/>
+            <w:shd w:fill="DCE6F1" w:color="auto" w:val="clear"/>
+            <w:tcMar>
+              <w:top w:type="dxa" w:w="60"/>
+              <w:left w:type="dxa" w:w="80"/>
+              <w:bottom w:type="dxa" w:w="60"/>
+              <w:right w:type="dxa" w:w="80"/>
+            </w:tcMar>
+          </w:tcPr>
+          <w:p>
+            <w:pPr>
+              <w:spacing w:after="0"/>
+            </w:pPr>
+            <w:r>
+              <w:rPr>
+                <w:b/>
+                <w:bCs/>
+                <w:sz w:val="18"/>
+                <w:szCs w:val="18"/>
+              </w:rPr>
+              <w:t xml:space="preserve">Rule runs</w:t>
+            </w:r>
+          </w:p>
+        </w:tc>
+      </w:tr>
+      <w:tr>
+        <w:tc>
+          <w:tcPr>
+            <w:tcW w:type="dxa" w:w="0"/>
+            <w:tcMar>
+              <w:top w:type="dxa" w:w="60"/>
+              <w:left w:type="dxa" w:w="80"/>
+              <w:bottom w:type="dxa" w:w="60"/>
+              <w:right w:type="dxa" w:w="80"/>
+            </w:tcMar>
+          </w:tcPr>
+          <w:p>
+            <w:pPr>
+              <w:spacing w:after="0"/>
+            </w:pPr>
+            <w:r>
+              <w:rPr>
+                <w:b w:val="false"/>
+                <w:bCs w:val="false"/>
+                <w:sz w:val="18"/>
+                <w:szCs w:val="18"/>
+              </w:rPr>
+              <w:t xml:space="preserve">AD-1</w:t>
+            </w:r>
+          </w:p>
+        </w:tc>
+        <w:tc>
+          <w:tcPr>
+            <w:tcW w:type="dxa" w:w="0"/>
+            <w:tcMar>
+              <w:top w:type="dxa" w:w="60"/>
+              <w:left w:type="dxa" w:w="80"/>
+              <w:bottom w:type="dxa" w:w="60"/>
+              <w:right w:type="dxa" w:w="80"/>
+            </w:tcMar>
+          </w:tcPr>
+          <w:p>
+            <w:pPr>
+              <w:spacing w:after="0"/>
+            </w:pPr>
+            <w:r>
+              <w:rPr>
+                <w:rFonts w:ascii="Consolas" w:cs="Consolas" w:eastAsia="Consolas" w:hAnsi="Consolas"/>
+                <w:b w:val="false"/>
+                <w:bCs w:val="false"/>
+                <w:sz w:val="18"/>
+                <w:szCs w:val="18"/>
+              </w:rPr>
+              <w:t xml:space="preserve">lab.dettest</w:t>
+            </w:r>
+            <w:r>
+              <w:rPr>
+                <w:b w:val="false"/>
+                <w:bCs w:val="false"/>
+                <w:sz w:val="18"/>
+                <w:szCs w:val="18"/>
+              </w:rPr>
+              <w:t xml:space="preserve"> added to </w:t>
+            </w:r>
+            <w:r>
+              <w:rPr>
+                <w:b w:val="false"/>
+                <w:bCs w:val="false"/>
+                <w:i/>
+                <w:iCs/>
+                <w:sz w:val="18"/>
+                <w:szCs w:val="18"/>
+              </w:rPr>
+              <w:t xml:space="preserve">Backup Operators</w:t>
+            </w:r>
+            <w:r>
+              <w:rPr>
+                <w:b w:val="false"/>
+                <w:bCs w:val="false"/>
+                <w:sz w:val="18"/>
+                <w:szCs w:val="18"/>
+              </w:rPr>
+              <w:t xml:space="preserve">, removed 20 s later</w:t>
+            </w:r>
+          </w:p>
+        </w:tc>
+        <w:tc>
+          <w:tcPr>
+            <w:tcW w:type="dxa" w:w="0"/>
+            <w:tcMar>
+              <w:top w:type="dxa" w:w="60"/>
+              <w:left w:type="dxa" w:w="80"/>
+              <w:bottom w:type="dxa" w:w="60"/>
+              <w:right w:type="dxa" w:w="80"/>
+            </w:tcMar>
+          </w:tcPr>
+          <w:p>
+            <w:pPr>
+              <w:spacing w:after="0"/>
+            </w:pPr>
+            <w:r>
+              <w:rPr>
+                <w:b w:val="false"/>
+                <w:bCs w:val="false"/>
+                <w:sz w:val="18"/>
+                <w:szCs w:val="18"/>
+              </w:rPr>
+              <w:t xml:space="preserve">User account added to built in domain local or global group; Account added and removed from privileged groups</w:t>
+            </w:r>
+          </w:p>
+        </w:tc>
+        <w:tc>
+          <w:tcPr>
+            <w:tcW w:type="dxa" w:w="0"/>
+            <w:tcMar>
+              <w:top w:type="dxa" w:w="60"/>
+              <w:left w:type="dxa" w:w="80"/>
+              <w:bottom w:type="dxa" w:w="60"/>
+              <w:right w:type="dxa" w:w="80"/>
+            </w:tcMar>
+          </w:tcPr>
+          <w:p>
+            <w:pPr>
+              <w:spacing w:after="0"/>
+            </w:pPr>
+            <w:r>
+              <w:rPr>
+                <w:b w:val="false"/>
+                <w:bCs w:val="false"/>
+                <w:sz w:val="18"/>
+                <w:szCs w:val="18"/>
+              </w:rPr>
+              <w:t xml:space="preserve">daily</w:t>
+            </w:r>
+          </w:p>
+        </w:tc>
+      </w:tr>
+      <w:tr>
+        <w:tc>
+          <w:tcPr>
+            <w:tcW w:type="dxa" w:w="0"/>
+            <w:tcMar>
+              <w:top w:type="dxa" w:w="60"/>
+              <w:left w:type="dxa" w:w="80"/>
+              <w:bottom w:type="dxa" w:w="60"/>
+              <w:right w:type="dxa" w:w="80"/>
+            </w:tcMar>
+          </w:tcPr>
+          <w:p>
+            <w:pPr>
+              <w:spacing w:after="0"/>
+            </w:pPr>
+            <w:r>
+              <w:rPr>
+                <w:b w:val="false"/>
+                <w:bCs w:val="false"/>
+                <w:sz w:val="18"/>
+                <w:szCs w:val="18"/>
+              </w:rPr>
+              <w:t xml:space="preserve">AD-2</w:t>
+            </w:r>
+          </w:p>
+        </w:tc>
+        <w:tc>
+          <w:tcPr>
+            <w:tcW w:type="dxa" w:w="0"/>
+            <w:tcMar>
+              <w:top w:type="dxa" w:w="60"/>
+              <w:left w:type="dxa" w:w="80"/>
+              <w:bottom w:type="dxa" w:w="60"/>
+              <w:right w:type="dxa" w:w="80"/>
+            </w:tcMar>
+          </w:tcPr>
+          <w:p>
+            <w:pPr>
+              <w:spacing w:after="0"/>
+            </w:pPr>
+            <w:r>
+              <w:rPr>
+                <w:rFonts w:ascii="Consolas" w:cs="Consolas" w:eastAsia="Consolas" w:hAnsi="Consolas"/>
+                <w:b w:val="false"/>
+                <w:bCs w:val="false"/>
+                <w:sz w:val="18"/>
+                <w:szCs w:val="18"/>
+              </w:rPr>
+              <w:t xml:space="preserve">lab.dettest</w:t>
+            </w:r>
+            <w:r>
+              <w:rPr>
+                <w:b w:val="false"/>
+                <w:bCs w:val="false"/>
+                <w:sz w:val="18"/>
+                <w:szCs w:val="18"/>
+              </w:rPr>
+              <w:t xml:space="preserve"> disabled and re-enabled</w:t>
+            </w:r>
+          </w:p>
+        </w:tc>
+        <w:tc>
+          <w:tcPr>
+            <w:tcW w:type="dxa" w:w="0"/>
+            <w:tcMar>
+              <w:top w:type="dxa" w:w="60"/>
+              <w:left w:type="dxa" w:w="80"/>
+              <w:bottom w:type="dxa" w:w="60"/>
+              <w:right w:type="dxa" w:w="80"/>
+            </w:tcMar>
+          </w:tcPr>
+          <w:p>
+            <w:pPr>
+              <w:spacing w:after="0"/>
+            </w:pPr>
+            <w:r>
+              <w:rPr>
+                <w:b w:val="false"/>
+                <w:bCs w:val="false"/>
+                <w:sz w:val="18"/>
+                <w:szCs w:val="18"/>
+              </w:rPr>
+              <w:t xml:space="preserve">User account enabled and disabled within 10 mins</w:t>
+            </w:r>
+          </w:p>
+        </w:tc>
+        <w:tc>
+          <w:tcPr>
+            <w:tcW w:type="dxa" w:w="0"/>
+            <w:tcMar>
+              <w:top w:type="dxa" w:w="60"/>
+              <w:left w:type="dxa" w:w="80"/>
+              <w:bottom w:type="dxa" w:w="60"/>
+              <w:right w:type="dxa" w:w="80"/>
+            </w:tcMar>
+          </w:tcPr>
+          <w:p>
+            <w:pPr>
+              <w:spacing w:after="0"/>
+            </w:pPr>
+            <w:r>
+              <w:rPr>
+                <w:b w:val="false"/>
+                <w:bCs w:val="false"/>
+                <w:sz w:val="18"/>
+                <w:szCs w:val="18"/>
+              </w:rPr>
+              <w:t xml:space="preserve">daily</w:t>
+            </w:r>
+          </w:p>
+        </w:tc>
+      </w:tr>
+      <w:tr>
+        <w:tc>
+          <w:tcPr>
+            <w:tcW w:type="dxa" w:w="0"/>
+            <w:tcMar>
+              <w:top w:type="dxa" w:w="60"/>
+              <w:left w:type="dxa" w:w="80"/>
+              <w:bottom w:type="dxa" w:w="60"/>
+              <w:right w:type="dxa" w:w="80"/>
+            </w:tcMar>
+          </w:tcPr>
+          <w:p>
+            <w:pPr>
+              <w:spacing w:after="0"/>
+            </w:pPr>
+            <w:r>
+              <w:rPr>
+                <w:b w:val="false"/>
+                <w:bCs w:val="false"/>
+                <w:sz w:val="18"/>
+                <w:szCs w:val="18"/>
+              </w:rPr>
+              <w:t xml:space="preserve">AD-3</w:t>
+            </w:r>
+          </w:p>
+        </w:tc>
+        <w:tc>
+          <w:tcPr>
+            <w:tcW w:type="dxa" w:w="0"/>
+            <w:tcMar>
+              <w:top w:type="dxa" w:w="60"/>
+              <w:left w:type="dxa" w:w="80"/>
+              <w:bottom w:type="dxa" w:w="60"/>
+              <w:right w:type="dxa" w:w="80"/>
+            </w:tcMar>
+          </w:tcPr>
+          <w:p>
+            <w:pPr>
+              <w:spacing w:after="0"/>
+            </w:pPr>
+            <w:r>
+              <w:rPr>
+                <w:b w:val="false"/>
+                <w:bCs w:val="false"/>
+                <w:i/>
+                <w:iCs/>
+                <w:sz w:val="18"/>
+                <w:szCs w:val="18"/>
+              </w:rPr>
+              <w:t xml:space="preserve">Password never expires</w:t>
+            </w:r>
+            <w:r>
+              <w:rPr>
+                <w:b w:val="false"/>
+                <w:bCs w:val="false"/>
+                <w:sz w:val="18"/>
+                <w:szCs w:val="18"/>
+              </w:rPr>
+              <w:t xml:space="preserve"> set</w:t>
+            </w:r>
+          </w:p>
+        </w:tc>
+        <w:tc>
+          <w:tcPr>
+            <w:tcW w:type="dxa" w:w="0"/>
+            <w:tcMar>
+              <w:top w:type="dxa" w:w="60"/>
+              <w:left w:type="dxa" w:w="80"/>
+              <w:bottom w:type="dxa" w:w="60"/>
+              <w:right w:type="dxa" w:w="80"/>
+            </w:tcMar>
+          </w:tcPr>
+          <w:p>
+            <w:pPr>
+              <w:spacing w:after="0"/>
+            </w:pPr>
+            <w:r>
+              <w:rPr>
+                <w:b w:val="false"/>
+                <w:bCs w:val="false"/>
+                <w:sz w:val="18"/>
+                <w:szCs w:val="18"/>
+              </w:rPr>
+              <w:t xml:space="preserve">AD account with Don't Expire Password</w:t>
+            </w:r>
+          </w:p>
+        </w:tc>
+        <w:tc>
+          <w:tcPr>
+            <w:tcW w:type="dxa" w:w="0"/>
+            <w:tcMar>
+              <w:top w:type="dxa" w:w="60"/>
+              <w:left w:type="dxa" w:w="80"/>
+              <w:bottom w:type="dxa" w:w="60"/>
+              <w:right w:type="dxa" w:w="80"/>
+            </w:tcMar>
+          </w:tcPr>
+          <w:p>
+            <w:pPr>
+              <w:spacing w:after="0"/>
+            </w:pPr>
+            <w:r>
+              <w:rPr>
+                <w:b w:val="false"/>
+                <w:bCs w:val="false"/>
+                <w:sz w:val="18"/>
+                <w:szCs w:val="18"/>
+              </w:rPr>
+              <w:t xml:space="preserve">daily</w:t>
+            </w:r>
+          </w:p>
+        </w:tc>
+      </w:tr>
+      <w:tr>
+        <w:tc>
+          <w:tcPr>
+            <w:tcW w:type="dxa" w:w="0"/>
+            <w:tcMar>
+              <w:top w:type="dxa" w:w="60"/>
+              <w:left w:type="dxa" w:w="80"/>
+              <w:bottom w:type="dxa" w:w="60"/>
+              <w:right w:type="dxa" w:w="80"/>
+            </w:tcMar>
+          </w:tcPr>
+          <w:p>
+            <w:pPr>
+              <w:spacing w:after="0"/>
+            </w:pPr>
+            <w:r>
+              <w:rPr>
+                <w:b w:val="false"/>
+                <w:bCs w:val="false"/>
+                <w:sz w:val="18"/>
+                <w:szCs w:val="18"/>
+              </w:rPr>
+              <w:t xml:space="preserve">AD-4</w:t>
+            </w:r>
+          </w:p>
+        </w:tc>
+        <w:tc>
+          <w:tcPr>
+            <w:tcW w:type="dxa" w:w="0"/>
+            <w:tcMar>
+              <w:top w:type="dxa" w:w="60"/>
+              <w:left w:type="dxa" w:w="80"/>
+              <w:bottom w:type="dxa" w:w="60"/>
+              <w:right w:type="dxa" w:w="80"/>
+            </w:tcMar>
+          </w:tcPr>
+          <w:p>
+            <w:pPr>
+              <w:spacing w:after="0"/>
+            </w:pPr>
+            <w:r>
+              <w:rPr>
+                <w:b w:val="false"/>
+                <w:bCs w:val="false"/>
+                <w:sz w:val="18"/>
+                <w:szCs w:val="18"/>
+              </w:rPr>
+              <w:t xml:space="preserve">6 bad passwords, then the right one</w:t>
+            </w:r>
+          </w:p>
+        </w:tc>
+        <w:tc>
+          <w:tcPr>
+            <w:tcW w:type="dxa" w:w="0"/>
+            <w:tcMar>
+              <w:top w:type="dxa" w:w="60"/>
+              <w:left w:type="dxa" w:w="80"/>
+              <w:bottom w:type="dxa" w:w="60"/>
+              <w:right w:type="dxa" w:w="80"/>
+            </w:tcMar>
+          </w:tcPr>
+          <w:p>
+            <w:pPr>
+              <w:spacing w:after="0"/>
+            </w:pPr>
+            <w:r>
+              <w:rPr>
+                <w:b w:val="false"/>
+                <w:bCs w:val="false"/>
+                <w:sz w:val="18"/>
+                <w:szCs w:val="18"/>
+              </w:rPr>
+              <w:t xml:space="preserve">SecurityEvent - Multiple authentication failures followed by a success</w:t>
+            </w:r>
+          </w:p>
+        </w:tc>
+        <w:tc>
+          <w:tcPr>
+            <w:tcW w:type="dxa" w:w="0"/>
+            <w:tcMar>
+              <w:top w:type="dxa" w:w="60"/>
+              <w:left w:type="dxa" w:w="80"/>
+              <w:bottom w:type="dxa" w:w="60"/>
+              <w:right w:type="dxa" w:w="80"/>
+            </w:tcMar>
+          </w:tcPr>
+          <w:p>
+            <w:pPr>
+              <w:spacing w:after="0"/>
+            </w:pPr>
+            <w:r>
+              <w:rPr>
+                <w:b w:val="false"/>
+                <w:bCs w:val="false"/>
+                <w:sz w:val="18"/>
+                <w:szCs w:val="18"/>
+              </w:rPr>
+              <w:t xml:space="preserve">every 2 h</w:t>
+            </w:r>
+          </w:p>
+        </w:tc>
+      </w:tr>
+      <w:tr>
+        <w:tc>
+          <w:tcPr>
+            <w:tcW w:type="dxa" w:w="0"/>
+            <w:tcMar>
+              <w:top w:type="dxa" w:w="60"/>
+              <w:left w:type="dxa" w:w="80"/>
+              <w:bottom w:type="dxa" w:w="60"/>
+              <w:right w:type="dxa" w:w="80"/>
+            </w:tcMar>
+          </w:tcPr>
+          <w:p>
+            <w:pPr>
+              <w:spacing w:after="0"/>
+            </w:pPr>
+            <w:r>
+              <w:rPr>
+                <w:b w:val="false"/>
+                <w:bCs w:val="false"/>
+                <w:sz w:val="18"/>
+                <w:szCs w:val="18"/>
+              </w:rPr>
+              <w:t xml:space="preserve">AD-5</w:t>
+            </w:r>
+          </w:p>
+        </w:tc>
+        <w:tc>
+          <w:tcPr>
+            <w:tcW w:type="dxa" w:w="0"/>
+            <w:tcMar>
+              <w:top w:type="dxa" w:w="60"/>
+              <w:left w:type="dxa" w:w="80"/>
+              <w:bottom w:type="dxa" w:w="60"/>
+              <w:right w:type="dxa" w:w="80"/>
+            </w:tcMar>
+          </w:tcPr>
+          <w:p>
+            <w:pPr>
+              <w:spacing w:after="0"/>
+            </w:pPr>
+            <w:r>
+              <w:rPr>
+                <w:b w:val="false"/>
+                <w:bCs w:val="false"/>
+                <w:sz w:val="18"/>
+                <w:szCs w:val="18"/>
+              </w:rPr>
+              <w:t xml:space="preserve">25 bad passwords inside a minute</w:t>
+            </w:r>
+          </w:p>
+        </w:tc>
+        <w:tc>
+          <w:tcPr>
+            <w:tcW w:type="dxa" w:w="0"/>
+            <w:tcMar>
+              <w:top w:type="dxa" w:w="60"/>
+              <w:left w:type="dxa" w:w="80"/>
+              <w:bottom w:type="dxa" w:w="60"/>
+              <w:right w:type="dxa" w:w="80"/>
+            </w:tcMar>
+          </w:tcPr>
+          <w:p>
+            <w:pPr>
+              <w:spacing w:after="0"/>
+            </w:pPr>
+            <w:r>
+              <w:rPr>
+                <w:b w:val="false"/>
+                <w:bCs w:val="false"/>
+                <w:sz w:val="18"/>
+                <w:szCs w:val="18"/>
+              </w:rPr>
+              <w:t xml:space="preserve">Failed logon attempts by valid accounts within 10 mins</w:t>
+            </w:r>
+          </w:p>
+        </w:tc>
+        <w:tc>
+          <w:tcPr>
+            <w:tcW w:type="dxa" w:w="0"/>
+            <w:tcMar>
+              <w:top w:type="dxa" w:w="60"/>
+              <w:left w:type="dxa" w:w="80"/>
+              <w:bottom w:type="dxa" w:w="60"/>
+              <w:right w:type="dxa" w:w="80"/>
+            </w:tcMar>
+          </w:tcPr>
+          <w:p>
+            <w:pPr>
+              <w:spacing w:after="0"/>
+            </w:pPr>
+            <w:r>
+              <w:rPr>
+                <w:b w:val="false"/>
+                <w:bCs w:val="false"/>
+                <w:sz w:val="18"/>
+                <w:szCs w:val="18"/>
+              </w:rPr>
+              <w:t xml:space="preserve">every 10 min</w:t>
+            </w:r>
+          </w:p>
+        </w:tc>
+      </w:tr>
+      <w:tr>
+        <w:tc>
+          <w:tcPr>
+            <w:tcW w:type="dxa" w:w="0"/>
+            <w:tcMar>
+              <w:top w:type="dxa" w:w="60"/>
+              <w:left w:type="dxa" w:w="80"/>
+              <w:bottom w:type="dxa" w:w="60"/>
+              <w:right w:type="dxa" w:w="80"/>
+            </w:tcMar>
+          </w:tcPr>
+          <w:p>
+            <w:pPr>
+              <w:spacing w:after="0"/>
+            </w:pPr>
+            <w:r>
+              <w:rPr>
+                <w:b w:val="false"/>
+                <w:bCs w:val="false"/>
+                <w:sz w:val="18"/>
+                <w:szCs w:val="18"/>
+              </w:rPr>
+              <w:t xml:space="preserve">AD-6</w:t>
+            </w:r>
+          </w:p>
+        </w:tc>
+        <w:tc>
+          <w:tcPr>
+            <w:tcW w:type="dxa" w:w="0"/>
+            <w:tcMar>
+              <w:top w:type="dxa" w:w="60"/>
+              <w:left w:type="dxa" w:w="80"/>
+              <w:bottom w:type="dxa" w:w="60"/>
+              <w:right w:type="dxa" w:w="80"/>
+            </w:tcMar>
+          </w:tcPr>
+          <w:p>
+            <w:pPr>
+              <w:spacing w:after="0"/>
+            </w:pPr>
+            <w:r>
+              <w:rPr>
+                <w:rFonts w:ascii="Consolas" w:cs="Consolas" w:eastAsia="Consolas" w:hAnsi="Consolas"/>
+                <w:b w:val="false"/>
+                <w:bCs w:val="false"/>
+                <w:sz w:val="18"/>
+                <w:szCs w:val="18"/>
+              </w:rPr>
+              <w:t xml:space="preserve">lab.dettest</w:t>
+            </w:r>
+            <w:r>
+              <w:rPr>
+                <w:b w:val="false"/>
+                <w:bCs w:val="false"/>
+                <w:sz w:val="18"/>
+                <w:szCs w:val="18"/>
+              </w:rPr>
+              <w:t xml:space="preserve"> deleted minutes after creation</w:t>
+            </w:r>
+          </w:p>
+        </w:tc>
+        <w:tc>
+          <w:tcPr>
+            <w:tcW w:type="dxa" w:w="0"/>
+            <w:tcMar>
+              <w:top w:type="dxa" w:w="60"/>
+              <w:left w:type="dxa" w:w="80"/>
+              <w:bottom w:type="dxa" w:w="60"/>
+              <w:right w:type="dxa" w:w="80"/>
+            </w:tcMar>
+          </w:tcPr>
+          <w:p>
+            <w:pPr>
+              <w:spacing w:after="0"/>
+            </w:pPr>
+            <w:r>
+              <w:rPr>
+                <w:b w:val="false"/>
+                <w:bCs w:val="false"/>
+                <w:sz w:val="18"/>
+                <w:szCs w:val="18"/>
+              </w:rPr>
+              <w:t xml:space="preserve">User account created and deleted within 10 mins; AD user enabled and password not set within 48 hours</w:t>
+            </w:r>
+          </w:p>
+        </w:tc>
+        <w:tc>
+          <w:tcPr>
+            <w:tcW w:type="dxa" w:w="0"/>
+            <w:tcMar>
+              <w:top w:type="dxa" w:w="60"/>
+              <w:left w:type="dxa" w:w="80"/>
+              <w:bottom w:type="dxa" w:w="60"/>
+              <w:right w:type="dxa" w:w="80"/>
+            </w:tcMar>
+          </w:tcPr>
+          <w:p>
+            <w:pPr>
+              <w:spacing w:after="0"/>
+            </w:pPr>
+            <w:r>
+              <w:rPr>
+                <w:b w:val="false"/>
+                <w:bCs w:val="false"/>
+                <w:sz w:val="18"/>
+                <w:szCs w:val="18"/>
+              </w:rPr>
+              <w:t xml:space="preserve">daily</w:t>
+            </w:r>
+          </w:p>
+        </w:tc>
+      </w:tr>
+      <w:tr>
+        <w:tc>
+          <w:tcPr>
+            <w:tcW w:type="dxa" w:w="0"/>
+            <w:tcMar>
+              <w:top w:type="dxa" w:w="60"/>
+              <w:left w:type="dxa" w:w="80"/>
+              <w:bottom w:type="dxa" w:w="60"/>
+              <w:right w:type="dxa" w:w="80"/>
+            </w:tcMar>
+          </w:tcPr>
+          <w:p>
+            <w:pPr>
+              <w:spacing w:after="0"/>
+            </w:pPr>
+            <w:r>
+              <w:rPr>
+                <w:b w:val="false"/>
+                <w:bCs w:val="false"/>
+                <w:sz w:val="18"/>
+                <w:szCs w:val="18"/>
+              </w:rPr>
+              <w:t xml:space="preserve">LNX-1</w:t>
+            </w:r>
+          </w:p>
+        </w:tc>
+        <w:tc>
+          <w:tcPr>
+            <w:tcW w:type="dxa" w:w="0"/>
+            <w:tcMar>
+              <w:top w:type="dxa" w:w="60"/>
+              <w:left w:type="dxa" w:w="80"/>
+              <w:bottom w:type="dxa" w:w="60"/>
+              <w:right w:type="dxa" w:w="80"/>
+            </w:tcMar>
+          </w:tcPr>
+          <w:p>
+            <w:pPr>
+              <w:spacing w:after="0"/>
+            </w:pPr>
+            <w:r>
+              <w:rPr>
+                <w:b w:val="false"/>
+                <w:bCs w:val="false"/>
+                <w:sz w:val="18"/>
+                <w:szCs w:val="18"/>
+              </w:rPr>
+              <w:t xml:space="preserve">20 SSH password attempts for a non-existent user, </w:t>
+            </w:r>
+            <w:r>
+              <w:rPr>
+                <w:rFonts w:ascii="Consolas" w:cs="Consolas" w:eastAsia="Consolas" w:hAnsi="Consolas"/>
+                <w:b w:val="false"/>
+                <w:bCs w:val="false"/>
+                <w:sz w:val="18"/>
+                <w:szCs w:val="18"/>
+              </w:rPr>
+              <w:t xml:space="preserve">lab-ubu01</w:t>
+            </w:r>
+            <w:r>
+              <w:rPr>
+                <w:b w:val="false"/>
+                <w:bCs w:val="false"/>
+                <w:sz w:val="18"/>
+                <w:szCs w:val="18"/>
+              </w:rPr>
+              <w:t xml:space="preserve"> → </w:t>
+            </w:r>
+            <w:r>
+              <w:rPr>
+                <w:rFonts w:ascii="Consolas" w:cs="Consolas" w:eastAsia="Consolas" w:hAnsi="Consolas"/>
+                <w:b w:val="false"/>
+                <w:bCs w:val="false"/>
+                <w:sz w:val="18"/>
+                <w:szCs w:val="18"/>
+              </w:rPr>
+              <w:t xml:space="preserve">lab-rhel01</w:t>
+            </w:r>
+          </w:p>
+        </w:tc>
+        <w:tc>
+          <w:tcPr>
+            <w:tcW w:type="dxa" w:w="0"/>
+            <w:tcMar>
+              <w:top w:type="dxa" w:w="60"/>
+              <w:left w:type="dxa" w:w="80"/>
+              <w:bottom w:type="dxa" w:w="60"/>
+              <w:right w:type="dxa" w:w="80"/>
+            </w:tcMar>
+          </w:tcPr>
+          <w:p>
+            <w:pPr>
+              <w:spacing w:after="0"/>
+            </w:pPr>
+            <w:r>
+              <w:rPr>
+                <w:b w:val="false"/>
+                <w:bCs w:val="false"/>
+                <w:sz w:val="18"/>
+                <w:szCs w:val="18"/>
+              </w:rPr>
+              <w:t xml:space="preserve">SSH - Potential Brute Force; Failed logon attempts in authpriv</w:t>
+            </w:r>
+          </w:p>
+        </w:tc>
+        <w:tc>
+          <w:tcPr>
+            <w:tcW w:type="dxa" w:w="0"/>
+            <w:tcMar>
+              <w:top w:type="dxa" w:w="60"/>
+              <w:left w:type="dxa" w:w="80"/>
+              <w:bottom w:type="dxa" w:w="60"/>
+              <w:right w:type="dxa" w:w="80"/>
+            </w:tcMar>
+          </w:tcPr>
+          <w:p>
+            <w:pPr>
+              <w:spacing w:after="0"/>
+            </w:pPr>
+            <w:r>
+              <w:rPr>
+                <w:b w:val="false"/>
+                <w:bCs w:val="false"/>
+                <w:sz w:val="18"/>
+                <w:szCs w:val="18"/>
+              </w:rPr>
+              <w:t xml:space="preserve">daily</w:t>
+            </w:r>
+          </w:p>
+        </w:tc>
+      </w:tr>
+      <w:tr>
+        <w:tc>
+          <w:tcPr>
+            <w:tcW w:type="dxa" w:w="0"/>
+            <w:tcMar>
+              <w:top w:type="dxa" w:w="60"/>
+              <w:left w:type="dxa" w:w="80"/>
+              <w:bottom w:type="dxa" w:w="60"/>
+              <w:right w:type="dxa" w:w="80"/>
+            </w:tcMar>
+          </w:tcPr>
+          <w:p>
+            <w:pPr>
+              <w:spacing w:after="0"/>
+            </w:pPr>
+            <w:r>
+              <w:rPr>
+                <w:b w:val="false"/>
+                <w:bCs w:val="false"/>
+                <w:sz w:val="18"/>
+                <w:szCs w:val="18"/>
+              </w:rPr>
+              <w:t xml:space="preserve">MDE-1</w:t>
+            </w:r>
+          </w:p>
+        </w:tc>
+        <w:tc>
+          <w:tcPr>
+            <w:tcW w:type="dxa" w:w="0"/>
+            <w:tcMar>
+              <w:top w:type="dxa" w:w="60"/>
+              <w:left w:type="dxa" w:w="80"/>
+              <w:bottom w:type="dxa" w:w="60"/>
+              <w:right w:type="dxa" w:w="80"/>
+            </w:tcMar>
+          </w:tcPr>
+          <w:p>
+            <w:pPr>
+              <w:spacing w:after="0"/>
+            </w:pPr>
+            <w:r>
+              <w:rPr>
+                <w:b w:val="false"/>
+                <w:bCs w:val="false"/>
+                <w:sz w:val="18"/>
+                <w:szCs w:val="18"/>
+              </w:rPr>
+              <w:t xml:space="preserve">Microsoft's documented Defender for Endpoint detection test on </w:t>
+            </w:r>
+            <w:r>
+              <w:rPr>
+                <w:rFonts w:ascii="Consolas" w:cs="Consolas" w:eastAsia="Consolas" w:hAnsi="Consolas"/>
+                <w:b w:val="false"/>
+                <w:bCs w:val="false"/>
+                <w:sz w:val="18"/>
+                <w:szCs w:val="18"/>
+              </w:rPr>
+              <w:t xml:space="preserve">lab-cl02</w:t>
+            </w:r>
+          </w:p>
+        </w:tc>
+        <w:tc>
+          <w:tcPr>
+            <w:tcW w:type="dxa" w:w="0"/>
+            <w:tcMar>
+              <w:top w:type="dxa" w:w="60"/>
+              <w:left w:type="dxa" w:w="80"/>
+              <w:bottom w:type="dxa" w:w="60"/>
+              <w:right w:type="dxa" w:w="80"/>
+            </w:tcMar>
+          </w:tcPr>
+          <w:p>
+            <w:pPr>
+              <w:spacing w:after="0"/>
+            </w:pPr>
+            <w:r>
+              <w:rPr>
+                <w:b w:val="false"/>
+                <w:bCs w:val="false"/>
+                <w:sz w:val="18"/>
+                <w:szCs w:val="18"/>
+              </w:rPr>
+              <w:t xml:space="preserve">Defender alert → incident</w:t>
+            </w:r>
+          </w:p>
+        </w:tc>
+        <w:tc>
+          <w:tcPr>
+            <w:tcW w:type="dxa" w:w="0"/>
+            <w:tcMar>
+              <w:top w:type="dxa" w:w="60"/>
+              <w:left w:type="dxa" w:w="80"/>
+              <w:bottom w:type="dxa" w:w="60"/>
+              <w:right w:type="dxa" w:w="80"/>
+            </w:tcMar>
+          </w:tcPr>
+          <w:p>
+            <w:pPr>
+              <w:spacing w:after="0"/>
+            </w:pPr>
+            <w:r>
+              <w:rPr>
+                <w:b w:val="false"/>
+                <w:bCs w:val="false"/>
+                <w:sz w:val="18"/>
+                <w:szCs w:val="18"/>
+              </w:rPr>
+              <w:t xml:space="preserve">minutes</w:t>
+            </w:r>
+          </w:p>
+        </w:tc>
+      </w:tr>
+      <w:tr>
+        <w:tc>
+          <w:tcPr>
+            <w:tcW w:type="dxa" w:w="0"/>
+            <w:tcMar>
+              <w:top w:type="dxa" w:w="60"/>
+              <w:left w:type="dxa" w:w="80"/>
+              <w:bottom w:type="dxa" w:w="60"/>
+              <w:right w:type="dxa" w:w="80"/>
+            </w:tcMar>
+          </w:tcPr>
+          <w:p>
+            <w:pPr>
+              <w:spacing w:after="0"/>
+            </w:pPr>
+            <w:r>
+              <w:rPr>
+                <w:b w:val="false"/>
+                <w:bCs w:val="false"/>
+                <w:sz w:val="18"/>
+                <w:szCs w:val="18"/>
+              </w:rPr>
+              <w:t xml:space="preserve">MDE-2</w:t>
+            </w:r>
+          </w:p>
+        </w:tc>
+        <w:tc>
+          <w:tcPr>
+            <w:tcW w:type="dxa" w:w="0"/>
+            <w:tcMar>
+              <w:top w:type="dxa" w:w="60"/>
+              <w:left w:type="dxa" w:w="80"/>
+              <w:bottom w:type="dxa" w:w="60"/>
+              <w:right w:type="dxa" w:w="80"/>
+            </w:tcMar>
+          </w:tcPr>
+          <w:p>
+            <w:pPr>
+              <w:spacing w:after="0"/>
+            </w:pPr>
+            <w:r>
+              <w:rPr>
+                <w:b w:val="false"/>
+                <w:bCs w:val="false"/>
+                <w:sz w:val="18"/>
+                <w:szCs w:val="18"/>
+              </w:rPr>
+              <w:t xml:space="preserve">EICAR antivirus test file on </w:t>
+            </w:r>
+            <w:r>
+              <w:rPr>
+                <w:rFonts w:ascii="Consolas" w:cs="Consolas" w:eastAsia="Consolas" w:hAnsi="Consolas"/>
+                <w:b w:val="false"/>
+                <w:bCs w:val="false"/>
+                <w:sz w:val="18"/>
+                <w:szCs w:val="18"/>
+              </w:rPr>
+              <w:t xml:space="preserve">lab-cl03</w:t>
+            </w:r>
+          </w:p>
+        </w:tc>
+        <w:tc>
+          <w:tcPr>
+            <w:tcW w:type="dxa" w:w="0"/>
+            <w:tcMar>
+              <w:top w:type="dxa" w:w="60"/>
+              <w:left w:type="dxa" w:w="80"/>
+              <w:bottom w:type="dxa" w:w="60"/>
+              <w:right w:type="dxa" w:w="80"/>
+            </w:tcMar>
+          </w:tcPr>
+          <w:p>
+            <w:pPr>
+              <w:spacing w:after="0"/>
+            </w:pPr>
+            <w:r>
+              <w:rPr>
+                <w:b w:val="false"/>
+                <w:bCs w:val="false"/>
+                <w:i/>
+                <w:iCs/>
+                <w:sz w:val="18"/>
+                <w:szCs w:val="18"/>
+              </w:rPr>
+              <w:t xml:space="preserve">'EICAR_Test_File' malware was prevented</w:t>
+            </w:r>
+            <w:r>
+              <w:rPr>
+                <w:b w:val="false"/>
+                <w:bCs w:val="false"/>
+                <w:sz w:val="18"/>
+                <w:szCs w:val="18"/>
+              </w:rPr>
+              <w:t xml:space="preserve"> → incident</w:t>
+            </w:r>
+          </w:p>
+        </w:tc>
+        <w:tc>
+          <w:tcPr>
+            <w:tcW w:type="dxa" w:w="0"/>
+            <w:tcMar>
+              <w:top w:type="dxa" w:w="60"/>
+              <w:left w:type="dxa" w:w="80"/>
+              <w:bottom w:type="dxa" w:w="60"/>
+              <w:right w:type="dxa" w:w="80"/>
+            </w:tcMar>
+          </w:tcPr>
+          <w:p>
+            <w:pPr>
+              <w:spacing w:after="0"/>
+            </w:pPr>
+            <w:r>
+              <w:rPr>
+                <w:b w:val="false"/>
+                <w:bCs w:val="false"/>
+                <w:sz w:val="18"/>
+                <w:szCs w:val="18"/>
+              </w:rPr>
+              <w:t xml:space="preserve">minutes</w:t>
+            </w:r>
+          </w:p>
+        </w:tc>
+      </w:tr>
+      <w:tr>
+        <w:tc>
+          <w:tcPr>
+            <w:tcW w:type="dxa" w:w="0"/>
+            <w:tcMar>
+              <w:top w:type="dxa" w:w="60"/>
+              <w:left w:type="dxa" w:w="80"/>
+              <w:bottom w:type="dxa" w:w="60"/>
+              <w:right w:type="dxa" w:w="80"/>
+            </w:tcMar>
+          </w:tcPr>
+          <w:p>
+            <w:pPr>
+              <w:spacing w:after="0"/>
+            </w:pPr>
+            <w:r>
+              <w:rPr>
+                <w:b w:val="false"/>
+                <w:bCs w:val="false"/>
+                <w:sz w:val="18"/>
+                <w:szCs w:val="18"/>
+              </w:rPr>
+              <w:t xml:space="preserve">MDE-3</w:t>
+            </w:r>
+          </w:p>
+        </w:tc>
+        <w:tc>
+          <w:tcPr>
+            <w:tcW w:type="dxa" w:w="0"/>
+            <w:tcMar>
+              <w:top w:type="dxa" w:w="60"/>
+              <w:left w:type="dxa" w:w="80"/>
+              <w:bottom w:type="dxa" w:w="60"/>
+              <w:right w:type="dxa" w:w="80"/>
+            </w:tcMar>
+          </w:tcPr>
+          <w:p>
+            <w:pPr>
+              <w:spacing w:after="0"/>
+            </w:pPr>
+            <w:r>
+              <w:rPr>
+                <w:b w:val="false"/>
+                <w:bCs w:val="false"/>
+                <w:sz w:val="18"/>
+                <w:szCs w:val="18"/>
+              </w:rPr>
+              <w:t xml:space="preserve">EICAR file + on-demand scan on </w:t>
+            </w:r>
+            <w:r>
+              <w:rPr>
+                <w:rFonts w:ascii="Consolas" w:cs="Consolas" w:eastAsia="Consolas" w:hAnsi="Consolas"/>
+                <w:b w:val="false"/>
+                <w:bCs w:val="false"/>
+                <w:sz w:val="18"/>
+                <w:szCs w:val="18"/>
+              </w:rPr>
+              <w:t xml:space="preserve">lab-ubu01</w:t>
+            </w:r>
+          </w:p>
+        </w:tc>
+        <w:tc>
+          <w:tcPr>
+            <w:tcW w:type="dxa" w:w="0"/>
+            <w:tcMar>
+              <w:top w:type="dxa" w:w="60"/>
+              <w:left w:type="dxa" w:w="80"/>
+              <w:bottom w:type="dxa" w:w="60"/>
+              <w:right w:type="dxa" w:w="80"/>
+            </w:tcMar>
+          </w:tcPr>
+          <w:p>
+            <w:pPr>
+              <w:spacing w:after="0"/>
+            </w:pPr>
+            <w:r>
+              <w:rPr>
+                <w:b w:val="false"/>
+                <w:bCs w:val="false"/>
+                <w:sz w:val="18"/>
+                <w:szCs w:val="18"/>
+              </w:rPr>
+              <w:t xml:space="preserve">Defender alert for EICAR</w:t>
+            </w:r>
+          </w:p>
+        </w:tc>
+        <w:tc>
+          <w:tcPr>
+            <w:tcW w:type="dxa" w:w="0"/>
+            <w:tcMar>
+              <w:top w:type="dxa" w:w="60"/>
+              <w:left w:type="dxa" w:w="80"/>
+              <w:bottom w:type="dxa" w:w="60"/>
+              <w:right w:type="dxa" w:w="80"/>
+            </w:tcMar>
+          </w:tcPr>
+          <w:p>
+            <w:pPr>
+              <w:spacing w:after="0"/>
+            </w:pPr>
+            <w:r>
+              <w:rPr>
+                <w:b w:val="false"/>
+                <w:bCs w:val="false"/>
+                <w:sz w:val="18"/>
+                <w:szCs w:val="18"/>
+              </w:rPr>
+              <w:t xml:space="preserve">minutes</w:t>
+            </w:r>
+          </w:p>
+        </w:tc>
+      </w:tr>
+    </w:tbl>
+    <w:p>
+      <w:pPr>
+        <w:spacing w:after="120"/>
+      </w:pPr>
+    </w:p>
+    <w:p>
+      <w:pPr>
+        <w:spacing w:after="120"/>
+      </w:pPr>
+      <w:r>
+        <w:t xml:space="preserve">The script waits up to 25 minutes for the fast detections and prints the table every 5 minutes. A rule marked </w:t>
+      </w:r>
+      <w:r>
+        <w:rPr>
+          <w:i/>
+          <w:iCs/>
+        </w:rPr>
+        <w:t xml:space="preserve">daily</w:t>
+      </w:r>
+      <w:r>
+        <w:t xml:space="preserve"> runs once every 24 hours from when it was created (the moment Post-Deploy enabled it), so re-run the same command with </w:t>
+      </w:r>
+      <w:r>
+        <w:rPr>
+          <w:rFonts w:ascii="Consolas" w:cs="Consolas" w:eastAsia="Consolas" w:hAnsi="Consolas"/>
+          <w:sz w:val="18"/>
+          <w:szCs w:val="18"/>
+        </w:rPr>
+        <w:t xml:space="preserve">-VerifyOnly</w:t>
+      </w:r>
+      <w:r>
+        <w:t xml:space="preserve"> the next day; it remembers when the test ran. </w:t>
+      </w:r>
+      <w:r>
+        <w:rPr>
+          <w:rFonts w:ascii="Consolas" w:cs="Consolas" w:eastAsia="Consolas" w:hAnsi="Consolas"/>
+          <w:sz w:val="18"/>
+          <w:szCs w:val="18"/>
+        </w:rPr>
+        <w:t xml:space="preserve">-Only AD</w:t>
+      </w:r>
+      <w:r>
+        <w:t xml:space="preserve">, </w:t>
+      </w:r>
+      <w:r>
+        <w:rPr>
+          <w:rFonts w:ascii="Consolas" w:cs="Consolas" w:eastAsia="Consolas" w:hAnsi="Consolas"/>
+          <w:sz w:val="18"/>
+          <w:szCs w:val="18"/>
+        </w:rPr>
+        <w:t xml:space="preserve">-Only LNX</w:t>
+      </w:r>
+      <w:r>
+        <w:t xml:space="preserve"> or </w:t>
+      </w:r>
+      <w:r>
+        <w:rPr>
+          <w:rFonts w:ascii="Consolas" w:cs="Consolas" w:eastAsia="Consolas" w:hAnsi="Consolas"/>
+          <w:sz w:val="18"/>
+          <w:szCs w:val="18"/>
+        </w:rPr>
+        <w:t xml:space="preserve">-Only MDE</w:t>
+      </w:r>
+      <w:r>
+        <w:t xml:space="preserve"> repeats one group. Every alert also shows up as an incident in the Defender portal (</w:t>
+      </w:r>
+      <w:r>
+        <w:rPr>
+          <w:rFonts w:ascii="Consolas" w:cs="Consolas" w:eastAsia="Consolas" w:hAnsi="Consolas"/>
+          <w:sz w:val="18"/>
+          <w:szCs w:val="18"/>
+        </w:rPr>
+        <w:t xml:space="preserve">security.microsoft.com</w:t>
+      </w:r>
+      <w:r>
+        <w:t xml:space="preserve"> → </w:t>
+      </w:r>
+      <w:r>
+        <w:rPr>
+          <w:i/>
+          <w:iCs/>
+        </w:rPr>
+        <w:t xml:space="preserve">Incidents &amp; alerts</w:t>
+      </w:r>
+      <w:r>
+        <w:t xml:space="preserve">) and in Microsoft Sentinel → </w:t>
+      </w:r>
+      <w:r>
+        <w:rPr>
+          <w:i/>
+          <w:iCs/>
+        </w:rPr>
+        <w:t xml:space="preserve">Incidents</w:t>
+      </w:r>
+      <w:r>
+        <w:t xml:space="preserve">.</w:t>
+      </w:r>
+    </w:p>
+    <w:p>
+      <w:pPr>
+        <w:spacing w:after="120"/>
+      </w:pPr>
+      <w:r>
+        <w:rPr>
+          <w:b/>
+          <w:bCs/>
+        </w:rPr>
+        <w:t xml:space="preserve">Result on the test lab (28 Oct 2026).</w:t>
+      </w:r>
+      <w:r>
+        <w:t xml:space="preserve"> The three fast detections fired within minutes of the test actions and each one opened an incident: MDE-1 (</w:t>
+      </w:r>
+      <w:r>
+        <w:rPr>
+          <w:i/>
+          <w:iCs/>
+        </w:rPr>
+        <w:t xml:space="preserve">Suspicious RunCommandExtension.exe behavior</w:t>
+      </w:r>
+      <w:r>
+        <w:t xml:space="preserve"> on </w:t>
+      </w:r>
+      <w:r>
+        <w:rPr>
+          <w:rFonts w:ascii="Consolas" w:cs="Consolas" w:eastAsia="Consolas" w:hAnsi="Consolas"/>
+          <w:sz w:val="18"/>
+          <w:szCs w:val="18"/>
+        </w:rPr>
+        <w:t xml:space="preserve">lab-cl02</w:t>
+      </w:r>
+      <w:r>
+        <w:t xml:space="preserve">) and MDE-2 (</w:t>
+      </w:r>
+      <w:r>
+        <w:rPr>
+          <w:i/>
+          <w:iCs/>
+        </w:rPr>
+        <w:t xml:space="preserve">'EICAR_Test_File' malware was prevented</w:t>
+      </w:r>
+      <w:r>
+        <w:t xml:space="preserve"> on </w:t>
+      </w:r>
+      <w:r>
+        <w:rPr>
+          <w:rFonts w:ascii="Consolas" w:cs="Consolas" w:eastAsia="Consolas" w:hAnsi="Consolas"/>
+          <w:sz w:val="18"/>
+          <w:szCs w:val="18"/>
+        </w:rPr>
+        <w:t xml:space="preserve">lab-cl03</w:t>
+      </w:r>
+      <w:r>
+        <w:t xml:space="preserve">) about 10 minutes after the run, and AD-5 (</w:t>
+      </w:r>
+      <w:r>
+        <w:rPr>
+          <w:i/>
+          <w:iCs/>
+        </w:rPr>
+        <w:t xml:space="preserve">Failed logon attempts by valid accounts within 10 mins</w:t>
+      </w:r>
+      <w:r>
+        <w:t xml:space="preserve">) at the rule's next 10-minute run. The daily and 2-hourly rules (AD-1 to AD-4, AD-6, LNX-1) show </w:t>
+      </w:r>
+      <w:r>
+        <w:rPr>
+          <w:i/>
+          <w:iCs/>
+        </w:rPr>
+        <w:t xml:space="preserve">pending</w:t>
+      </w:r>
+      <w:r>
+        <w:t xml:space="preserve"> until they next evaluate; re-run with </w:t>
+      </w:r>
+      <w:r>
+        <w:rPr>
+          <w:rFonts w:ascii="Consolas" w:cs="Consolas" w:eastAsia="Consolas" w:hAnsi="Consolas"/>
+          <w:sz w:val="18"/>
+          <w:szCs w:val="18"/>
+        </w:rPr>
+        <w:t xml:space="preserve">-VerifyOnly</w:t>
+      </w:r>
+      <w:r>
+        <w:t xml:space="preserve"> the next day. MDE-3 stayed </w:t>
+      </w:r>
+      <w:r>
+        <w:rPr>
+          <w:i/>
+          <w:iCs/>
+        </w:rPr>
+        <w:t xml:space="preserve">pending</w:t>
+      </w:r>
+      <w:r>
+        <w:t xml:space="preserve"> on the test lab: the Linux scan found and reported the EICAR file, but with real-time protection off on the Linux VMs no Defender alert followed (troubleshooting #63).</w:t>
+      </w:r>
+    </w:p>
+    <w:p>
+      <w:pPr>
+        <w:keepNext/>
+        <w:spacing w:after="20" w:before="60"/>
+        <w:jc w:val="center"/>
+      </w:pPr>
+      <w:r>
+        <w:drawing>
+          <wp:inline distT="0" distB="0" distL="0" distR="0">
+            <wp:extent cx="6172200" cy="2362200"/>
+            <wp:effectExtent t="0" r="0" b="0" l="0"/>
+            <wp:docPr id="1" name="" descr="" title=""/>
+            <wp:cNvGraphicFramePr>
+              <a:graphicFrameLocks xmlns:a="http://schemas.openxmlformats.org/drawingml/2006/main" noChangeAspect="1"/>
+            </wp:cNvGraphicFramePr>
+            <a:graphic xmlns:a="http://schemas.openxmlformats.org/drawingml/2006/main">
+              <a:graphicData uri="http://schemas.openxmlformats.org/drawingml/2006/picture">
+                <pic:pic xmlns:pic="http://schemas.openxmlformats.org/drawingml/2006/picture">
+                  <pic:nvPicPr>
+                    <pic:cNvPr id="0" name="" descr=""/>
+                    <pic:cNvPicPr>
+                      <a:picLocks noChangeAspect="1" noChangeArrowheads="1"/>
+                    </pic:cNvPicPr>
+                  </pic:nvPicPr>
+                  <pic:blipFill>
+                    <a:blip r:embed="rId37" cstate="none"/>
+                    <a:srcRect/>
+                    <a:stretch>
+                      <a:fillRect/>
+                    </a:stretch>
+                  </pic:blipFill>
+                  <pic:spPr bwMode="auto">
+                    <a:xfrm>
+                      <a:off x="0" y="0"/>
+                      <a:ext cx="6172200" cy="2362200"/>
+                    </a:xfrm>
+                    <a:prstGeom prst="rect">
+                      <a:avLst/>
+                    </a:prstGeom>
+                  </pic:spPr>
+                </pic:pic>
+              </a:graphicData>
+            </a:graphic>
+          </wp:inline>
+        </w:drawing>
+      </w:r>
+    </w:p>
+    <w:p>
+      <w:pPr>
+        <w:spacing w:after="200"/>
+        <w:jc w:val="center"/>
+      </w:pPr>
+      <w:r>
+        <w:rPr>
+          <w:i/>
+          <w:iCs/>
+          <w:color w:val="595959"/>
+          <w:sz w:val="17"/>
+          <w:szCs w:val="17"/>
+        </w:rPr>
+        <w:t xml:space="preserve">Figure: Detection test results from Cloud Shell</w:t>
+      </w:r>
+    </w:p>
+    <w:p>
+      <w:pPr>
         <w:pStyle w:val="Heading1"/>
         <w:pageBreakBefore/>
       </w:pPr>
@@ -17514,6 +19182,842 @@
                 <w:szCs w:val="18"/>
               </w:rPr>
               <w:t xml:space="preserve"> via Run command</w:t>
+            </w:r>
+          </w:p>
+        </w:tc>
+      </w:tr>
+      <w:tr>
+        <w:tc>
+          <w:tcPr>
+            <w:tcW w:type="dxa" w:w="0"/>
+            <w:tcMar>
+              <w:top w:type="dxa" w:w="60"/>
+              <w:left w:type="dxa" w:w="80"/>
+              <w:bottom w:type="dxa" w:w="60"/>
+              <w:right w:type="dxa" w:w="80"/>
+            </w:tcMar>
+          </w:tcPr>
+          <w:p>
+            <w:pPr>
+              <w:spacing w:after="0"/>
+            </w:pPr>
+            <w:r>
+              <w:rPr>
+                <w:b w:val="false"/>
+                <w:bCs w:val="false"/>
+                <w:sz w:val="18"/>
+                <w:szCs w:val="18"/>
+              </w:rPr>
+              <w:t xml:space="preserve">60</w:t>
+            </w:r>
+          </w:p>
+        </w:tc>
+        <w:tc>
+          <w:tcPr>
+            <w:tcW w:type="dxa" w:w="0"/>
+            <w:tcMar>
+              <w:top w:type="dxa" w:w="60"/>
+              <w:left w:type="dxa" w:w="80"/>
+              <w:bottom w:type="dxa" w:w="60"/>
+              <w:right w:type="dxa" w:w="80"/>
+            </w:tcMar>
+          </w:tcPr>
+          <w:p>
+            <w:pPr>
+              <w:spacing w:after="0"/>
+            </w:pPr>
+            <w:r>
+              <w:rPr>
+                <w:b w:val="false"/>
+                <w:bCs w:val="false"/>
+                <w:sz w:val="18"/>
+                <w:szCs w:val="18"/>
+              </w:rPr>
+              <w:t xml:space="preserve">Hydration / Verify</w:t>
+            </w:r>
+          </w:p>
+        </w:tc>
+        <w:tc>
+          <w:tcPr>
+            <w:tcW w:type="dxa" w:w="0"/>
+            <w:tcMar>
+              <w:top w:type="dxa" w:w="60"/>
+              <w:left w:type="dxa" w:w="80"/>
+              <w:bottom w:type="dxa" w:w="60"/>
+              <w:right w:type="dxa" w:w="80"/>
+            </w:tcMar>
+          </w:tcPr>
+          <w:p>
+            <w:pPr>
+              <w:spacing w:after="0"/>
+            </w:pPr>
+            <w:r>
+              <w:rPr>
+                <w:b w:val="false"/>
+                <w:bCs w:val="false"/>
+                <w:sz w:val="18"/>
+                <w:szCs w:val="18"/>
+              </w:rPr>
+              <w:t xml:space="preserve">The hydration check (6.5) shows group churn, sign-in failures and </w:t>
+            </w:r>
+            <w:r>
+              <w:rPr>
+                <w:rFonts w:ascii="Consolas" w:cs="Consolas" w:eastAsia="Consolas" w:hAnsi="Consolas"/>
+                <w:b w:val="false"/>
+                <w:bCs w:val="false"/>
+                <w:sz w:val="18"/>
+                <w:szCs w:val="18"/>
+              </w:rPr>
+              <w:t xml:space="preserve">nltest</w:t>
+            </w:r>
+            <w:r>
+              <w:rPr>
+                <w:b w:val="false"/>
+                <w:bCs w:val="false"/>
+                <w:sz w:val="18"/>
+                <w:szCs w:val="18"/>
+              </w:rPr>
+              <w:t xml:space="preserve"> up to a point in the night, then nothing; the Sentinel incident list stays almost empty</w:t>
+            </w:r>
+          </w:p>
+        </w:tc>
+        <w:tc>
+          <w:tcPr>
+            <w:tcW w:type="dxa" w:w="0"/>
+            <w:tcMar>
+              <w:top w:type="dxa" w:w="60"/>
+              <w:left w:type="dxa" w:w="80"/>
+              <w:bottom w:type="dxa" w:w="60"/>
+              <w:right w:type="dxa" w:w="80"/>
+            </w:tcMar>
+          </w:tcPr>
+          <w:p>
+            <w:pPr>
+              <w:spacing w:after="0"/>
+            </w:pPr>
+            <w:r>
+              <w:rPr>
+                <w:b w:val="false"/>
+                <w:bCs w:val="false"/>
+                <w:sz w:val="18"/>
+                <w:szCs w:val="18"/>
+              </w:rPr>
+              <w:t xml:space="preserve">Two separate things. All lab VMs are deallocated by the DevTest auto-shutdown at 03:00 UTC and nothing restarts them, so hydration pauses. And hydration is written to stay </w:t>
+            </w:r>
+            <w:r>
+              <w:rPr>
+                <w:b w:val="false"/>
+                <w:bCs w:val="false"/>
+                <w:i/>
+                <w:iCs/>
+                <w:sz w:val="18"/>
+                <w:szCs w:val="18"/>
+              </w:rPr>
+              <w:t xml:space="preserve">under</w:t>
+            </w:r>
+            <w:r>
+              <w:rPr>
+                <w:b w:val="false"/>
+                <w:bCs w:val="false"/>
+                <w:sz w:val="18"/>
+                <w:szCs w:val="18"/>
+              </w:rPr>
+              <w:t xml:space="preserve"> detection thresholds; it feeds hunting, it is not an alert generator</w:t>
+            </w:r>
+          </w:p>
+        </w:tc>
+        <w:tc>
+          <w:tcPr>
+            <w:tcW w:type="dxa" w:w="0"/>
+            <w:tcMar>
+              <w:top w:type="dxa" w:w="60"/>
+              <w:left w:type="dxa" w:w="80"/>
+              <w:bottom w:type="dxa" w:w="60"/>
+              <w:right w:type="dxa" w:w="80"/>
+            </w:tcMar>
+          </w:tcPr>
+          <w:p>
+            <w:pPr>
+              <w:spacing w:after="0"/>
+            </w:pPr>
+            <w:r>
+              <w:rPr>
+                <w:b w:val="false"/>
+                <w:bCs w:val="false"/>
+                <w:sz w:val="18"/>
+                <w:szCs w:val="18"/>
+              </w:rPr>
+              <w:t xml:space="preserve">Start the VMs (</w:t>
+            </w:r>
+            <w:r>
+              <w:rPr>
+                <w:rFonts w:ascii="Consolas" w:cs="Consolas" w:eastAsia="Consolas" w:hAnsi="Consolas"/>
+                <w:b w:val="false"/>
+                <w:bCs w:val="false"/>
+                <w:sz w:val="18"/>
+                <w:szCs w:val="18"/>
+              </w:rPr>
+              <w:t xml:space="preserve">az vm start</w:t>
+            </w:r>
+            <w:r>
+              <w:rPr>
+                <w:b w:val="false"/>
+                <w:bCs w:val="false"/>
+                <w:sz w:val="18"/>
+                <w:szCs w:val="18"/>
+              </w:rPr>
+              <w:t xml:space="preserve">, section 5.3). To see alerts and incidents, run </w:t>
+            </w:r>
+            <w:r>
+              <w:rPr>
+                <w:rFonts w:ascii="Consolas" w:cs="Consolas" w:eastAsia="Consolas" w:hAnsi="Consolas"/>
+                <w:b w:val="false"/>
+                <w:bCs w:val="false"/>
+                <w:sz w:val="18"/>
+                <w:szCs w:val="18"/>
+              </w:rPr>
+              <w:t xml:space="preserve">Test-LabDetections.ps1</w:t>
+            </w:r>
+            <w:r>
+              <w:rPr>
+                <w:b w:val="false"/>
+                <w:bCs w:val="false"/>
+                <w:sz w:val="18"/>
+                <w:szCs w:val="18"/>
+              </w:rPr>
+              <w:t xml:space="preserve"> (section 6.6)</w:t>
+            </w:r>
+          </w:p>
+        </w:tc>
+      </w:tr>
+      <w:tr>
+        <w:tc>
+          <w:tcPr>
+            <w:tcW w:type="dxa" w:w="0"/>
+            <w:tcMar>
+              <w:top w:type="dxa" w:w="60"/>
+              <w:left w:type="dxa" w:w="80"/>
+              <w:bottom w:type="dxa" w:w="60"/>
+              <w:right w:type="dxa" w:w="80"/>
+            </w:tcMar>
+          </w:tcPr>
+          <w:p>
+            <w:pPr>
+              <w:spacing w:after="0"/>
+            </w:pPr>
+            <w:r>
+              <w:rPr>
+                <w:b w:val="false"/>
+                <w:bCs w:val="false"/>
+                <w:sz w:val="18"/>
+                <w:szCs w:val="18"/>
+              </w:rPr>
+              <w:t xml:space="preserve">61</w:t>
+            </w:r>
+          </w:p>
+        </w:tc>
+        <w:tc>
+          <w:tcPr>
+            <w:tcW w:type="dxa" w:w="0"/>
+            <w:tcMar>
+              <w:top w:type="dxa" w:w="60"/>
+              <w:left w:type="dxa" w:w="80"/>
+              <w:bottom w:type="dxa" w:w="60"/>
+              <w:right w:type="dxa" w:w="80"/>
+            </w:tcMar>
+          </w:tcPr>
+          <w:p>
+            <w:pPr>
+              <w:spacing w:after="0"/>
+            </w:pPr>
+            <w:r>
+              <w:rPr>
+                <w:b w:val="false"/>
+                <w:bCs w:val="false"/>
+                <w:sz w:val="18"/>
+                <w:szCs w:val="18"/>
+              </w:rPr>
+              <w:t xml:space="preserve">Hydration (Linux)</w:t>
+            </w:r>
+          </w:p>
+        </w:tc>
+        <w:tc>
+          <w:tcPr>
+            <w:tcW w:type="dxa" w:w="0"/>
+            <w:tcMar>
+              <w:top w:type="dxa" w:w="60"/>
+              <w:left w:type="dxa" w:w="80"/>
+              <w:bottom w:type="dxa" w:w="60"/>
+              <w:right w:type="dxa" w:w="80"/>
+            </w:tcMar>
+          </w:tcPr>
+          <w:p>
+            <w:pPr>
+              <w:spacing w:after="0"/>
+            </w:pPr>
+            <w:r>
+              <w:rPr>
+                <w:b w:val="false"/>
+                <w:bCs w:val="false"/>
+                <w:sz w:val="18"/>
+                <w:szCs w:val="18"/>
+              </w:rPr>
+              <w:t xml:space="preserve">No Linux authentication failures in Syslog although the hydration script "tries a failed </w:t>
+            </w:r>
+            <w:r>
+              <w:rPr>
+                <w:rFonts w:ascii="Consolas" w:cs="Consolas" w:eastAsia="Consolas" w:hAnsi="Consolas"/>
+                <w:b w:val="false"/>
+                <w:bCs w:val="false"/>
+                <w:sz w:val="18"/>
+                <w:szCs w:val="18"/>
+              </w:rPr>
+              <w:t xml:space="preserve">su</w:t>
+            </w:r>
+            <w:r>
+              <w:rPr>
+                <w:b w:val="false"/>
+                <w:bCs w:val="false"/>
+                <w:sz w:val="18"/>
+                <w:szCs w:val="18"/>
+              </w:rPr>
+              <w:t xml:space="preserve">" every hour</w:t>
+            </w:r>
+          </w:p>
+        </w:tc>
+        <w:tc>
+          <w:tcPr>
+            <w:tcW w:type="dxa" w:w="0"/>
+            <w:tcMar>
+              <w:top w:type="dxa" w:w="60"/>
+              <w:left w:type="dxa" w:w="80"/>
+              <w:bottom w:type="dxa" w:w="60"/>
+              <w:right w:type="dxa" w:w="80"/>
+            </w:tcMar>
+          </w:tcPr>
+          <w:p>
+            <w:pPr>
+              <w:spacing w:after="0"/>
+            </w:pPr>
+            <w:r>
+              <w:rPr>
+                <w:b w:val="false"/>
+                <w:bCs w:val="false"/>
+                <w:sz w:val="18"/>
+                <w:szCs w:val="18"/>
+              </w:rPr>
+              <w:t xml:space="preserve">A non-interactive </w:t>
+            </w:r>
+            <w:r>
+              <w:rPr>
+                <w:rFonts w:ascii="Consolas" w:cs="Consolas" w:eastAsia="Consolas" w:hAnsi="Consolas"/>
+                <w:b w:val="false"/>
+                <w:bCs w:val="false"/>
+                <w:sz w:val="18"/>
+                <w:szCs w:val="18"/>
+              </w:rPr>
+              <w:t xml:space="preserve">su</w:t>
+            </w:r>
+            <w:r>
+              <w:rPr>
+                <w:b w:val="false"/>
+                <w:bCs w:val="false"/>
+                <w:sz w:val="18"/>
+                <w:szCs w:val="18"/>
+              </w:rPr>
+              <w:t xml:space="preserve"> with the password on stdin never reaches PAM (no TTY), so nothing is logged</w:t>
+            </w:r>
+          </w:p>
+        </w:tc>
+        <w:tc>
+          <w:tcPr>
+            <w:tcW w:type="dxa" w:w="0"/>
+            <w:tcMar>
+              <w:top w:type="dxa" w:w="60"/>
+              <w:left w:type="dxa" w:w="80"/>
+              <w:bottom w:type="dxa" w:w="60"/>
+              <w:right w:type="dxa" w:w="80"/>
+            </w:tcMar>
+          </w:tcPr>
+          <w:p>
+            <w:pPr>
+              <w:spacing w:after="0"/>
+            </w:pPr>
+            <w:r>
+              <w:rPr>
+                <w:rFonts w:ascii="Consolas" w:cs="Consolas" w:eastAsia="Consolas" w:hAnsi="Consolas"/>
+                <w:b w:val="false"/>
+                <w:bCs w:val="false"/>
+                <w:sz w:val="18"/>
+                <w:szCs w:val="18"/>
+              </w:rPr>
+              <w:t xml:space="preserve">hydrate-linux.sh</w:t>
+            </w:r>
+            <w:r>
+              <w:rPr>
+                <w:b w:val="false"/>
+                <w:bCs w:val="false"/>
+                <w:sz w:val="18"/>
+                <w:szCs w:val="18"/>
+              </w:rPr>
+              <w:t xml:space="preserve"> now makes one SSH password attempt for a non-existent user against the VM's own sshd every second hour (12 a day, under the 15-attempt rule thresholds); sshd/PAM log </w:t>
+            </w:r>
+            <w:r>
+              <w:rPr>
+                <w:b w:val="false"/>
+                <w:bCs w:val="false"/>
+                <w:i/>
+                <w:iCs/>
+                <w:sz w:val="18"/>
+                <w:szCs w:val="18"/>
+              </w:rPr>
+              <w:t xml:space="preserve">Failed password for invalid user</w:t>
+            </w:r>
+            <w:r>
+              <w:rPr>
+                <w:b w:val="false"/>
+                <w:bCs w:val="false"/>
+                <w:sz w:val="18"/>
+                <w:szCs w:val="18"/>
+              </w:rPr>
+              <w:t xml:space="preserve"> / </w:t>
+            </w:r>
+            <w:r>
+              <w:rPr>
+                <w:b w:val="false"/>
+                <w:bCs w:val="false"/>
+                <w:i/>
+                <w:iCs/>
+                <w:sz w:val="18"/>
+                <w:szCs w:val="18"/>
+              </w:rPr>
+              <w:t xml:space="preserve">user unknown</w:t>
+            </w:r>
+            <w:r>
+              <w:rPr>
+                <w:b w:val="false"/>
+                <w:bCs w:val="false"/>
+                <w:sz w:val="18"/>
+                <w:szCs w:val="18"/>
+              </w:rPr>
+              <w:t xml:space="preserve">. Existing labs keep the old script until redeployed</w:t>
+            </w:r>
+          </w:p>
+        </w:tc>
+      </w:tr>
+      <w:tr>
+        <w:tc>
+          <w:tcPr>
+            <w:tcW w:type="dxa" w:w="0"/>
+            <w:tcMar>
+              <w:top w:type="dxa" w:w="60"/>
+              <w:left w:type="dxa" w:w="80"/>
+              <w:bottom w:type="dxa" w:w="60"/>
+              <w:right w:type="dxa" w:w="80"/>
+            </w:tcMar>
+          </w:tcPr>
+          <w:p>
+            <w:pPr>
+              <w:spacing w:after="0"/>
+            </w:pPr>
+            <w:r>
+              <w:rPr>
+                <w:b w:val="false"/>
+                <w:bCs w:val="false"/>
+                <w:sz w:val="18"/>
+                <w:szCs w:val="18"/>
+              </w:rPr>
+              <w:t xml:space="preserve">62</w:t>
+            </w:r>
+          </w:p>
+        </w:tc>
+        <w:tc>
+          <w:tcPr>
+            <w:tcW w:type="dxa" w:w="0"/>
+            <w:tcMar>
+              <w:top w:type="dxa" w:w="60"/>
+              <w:left w:type="dxa" w:w="80"/>
+              <w:bottom w:type="dxa" w:w="60"/>
+              <w:right w:type="dxa" w:w="80"/>
+            </w:tcMar>
+          </w:tcPr>
+          <w:p>
+            <w:pPr>
+              <w:spacing w:after="0"/>
+            </w:pPr>
+            <w:r>
+              <w:rPr>
+                <w:b w:val="false"/>
+                <w:bCs w:val="false"/>
+                <w:sz w:val="18"/>
+                <w:szCs w:val="18"/>
+              </w:rPr>
+              <w:t xml:space="preserve">Detection test</w:t>
+            </w:r>
+          </w:p>
+        </w:tc>
+        <w:tc>
+          <w:tcPr>
+            <w:tcW w:type="dxa" w:w="0"/>
+            <w:tcMar>
+              <w:top w:type="dxa" w:w="60"/>
+              <w:left w:type="dxa" w:w="80"/>
+              <w:bottom w:type="dxa" w:w="60"/>
+              <w:right w:type="dxa" w:w="80"/>
+            </w:tcMar>
+          </w:tcPr>
+          <w:p>
+            <w:pPr>
+              <w:spacing w:after="0"/>
+            </w:pPr>
+            <w:r>
+              <w:rPr>
+                <w:rFonts w:ascii="Consolas" w:cs="Consolas" w:eastAsia="Consolas" w:hAnsi="Consolas"/>
+                <w:b w:val="false"/>
+                <w:bCs w:val="false"/>
+                <w:sz w:val="18"/>
+                <w:szCs w:val="18"/>
+              </w:rPr>
+              <w:t xml:space="preserve">Test-LabDetections.ps1</w:t>
+            </w:r>
+            <w:r>
+              <w:rPr>
+                <w:b w:val="false"/>
+                <w:bCs w:val="false"/>
+                <w:sz w:val="18"/>
+                <w:szCs w:val="18"/>
+              </w:rPr>
+              <w:t xml:space="preserve"> stops on the DC with </w:t>
+            </w:r>
+            <w:r>
+              <w:rPr>
+                <w:b w:val="false"/>
+                <w:bCs w:val="false"/>
+                <w:i/>
+                <w:iCs/>
+                <w:sz w:val="18"/>
+                <w:szCs w:val="18"/>
+              </w:rPr>
+              <w:t xml:space="preserve">Exception calling "ValidateCredentials" … The LDAP server is unavailable</w:t>
+            </w:r>
+            <w:r>
+              <w:rPr>
+                <w:b w:val="false"/>
+                <w:bCs w:val="false"/>
+                <w:sz w:val="18"/>
+                <w:szCs w:val="18"/>
+              </w:rPr>
+              <w:t xml:space="preserve"> partway through the bad-password burst; </w:t>
+            </w:r>
+            <w:r>
+              <w:rPr>
+                <w:rFonts w:ascii="Consolas" w:cs="Consolas" w:eastAsia="Consolas" w:hAnsi="Consolas"/>
+                <w:b w:val="false"/>
+                <w:bCs w:val="false"/>
+                <w:sz w:val="18"/>
+                <w:szCs w:val="18"/>
+              </w:rPr>
+              <w:t xml:space="preserve">lab.dettest</w:t>
+            </w:r>
+            <w:r>
+              <w:rPr>
+                <w:b w:val="false"/>
+                <w:bCs w:val="false"/>
+                <w:sz w:val="18"/>
+                <w:szCs w:val="18"/>
+              </w:rPr>
+              <w:t xml:space="preserve"> is left in AD</w:t>
+            </w:r>
+          </w:p>
+        </w:tc>
+        <w:tc>
+          <w:tcPr>
+            <w:tcW w:type="dxa" w:w="0"/>
+            <w:tcMar>
+              <w:top w:type="dxa" w:w="60"/>
+              <w:left w:type="dxa" w:w="80"/>
+              <w:bottom w:type="dxa" w:w="60"/>
+              <w:right w:type="dxa" w:w="80"/>
+            </w:tcMar>
+          </w:tcPr>
+          <w:p>
+            <w:pPr>
+              <w:spacing w:after="0"/>
+            </w:pPr>
+            <w:r>
+              <w:rPr>
+                <w:b w:val="false"/>
+                <w:bCs w:val="false"/>
+                <w:sz w:val="18"/>
+                <w:szCs w:val="18"/>
+              </w:rPr>
+              <w:t xml:space="preserve">After a run of failed binds the DC drops the reused LDAP connection</w:t>
+            </w:r>
+          </w:p>
+        </w:tc>
+        <w:tc>
+          <w:tcPr>
+            <w:tcW w:type="dxa" w:w="0"/>
+            <w:tcMar>
+              <w:top w:type="dxa" w:w="60"/>
+              <w:left w:type="dxa" w:w="80"/>
+              <w:bottom w:type="dxa" w:w="60"/>
+              <w:right w:type="dxa" w:w="80"/>
+            </w:tcMar>
+          </w:tcPr>
+          <w:p>
+            <w:pPr>
+              <w:spacing w:after="0"/>
+            </w:pPr>
+            <w:r>
+              <w:rPr>
+                <w:b w:val="false"/>
+                <w:bCs w:val="false"/>
+                <w:sz w:val="18"/>
+                <w:szCs w:val="18"/>
+              </w:rPr>
+              <w:t xml:space="preserve">The script opens a fresh connection per attempt, catches each failure and always deletes </w:t>
+            </w:r>
+            <w:r>
+              <w:rPr>
+                <w:rFonts w:ascii="Consolas" w:cs="Consolas" w:eastAsia="Consolas" w:hAnsi="Consolas"/>
+                <w:b w:val="false"/>
+                <w:bCs w:val="false"/>
+                <w:sz w:val="18"/>
+                <w:szCs w:val="18"/>
+              </w:rPr>
+              <w:t xml:space="preserve">lab.dettest</w:t>
+            </w:r>
+            <w:r>
+              <w:rPr>
+                <w:b w:val="false"/>
+                <w:bCs w:val="false"/>
+                <w:sz w:val="18"/>
+                <w:szCs w:val="18"/>
+              </w:rPr>
+              <w:t xml:space="preserve"> (it also removes leftovers at the start of the next run)</w:t>
+            </w:r>
+          </w:p>
+        </w:tc>
+      </w:tr>
+      <w:tr>
+        <w:tc>
+          <w:tcPr>
+            <w:tcW w:type="dxa" w:w="0"/>
+            <w:tcMar>
+              <w:top w:type="dxa" w:w="60"/>
+              <w:left w:type="dxa" w:w="80"/>
+              <w:bottom w:type="dxa" w:w="60"/>
+              <w:right w:type="dxa" w:w="80"/>
+            </w:tcMar>
+          </w:tcPr>
+          <w:p>
+            <w:pPr>
+              <w:spacing w:after="0"/>
+            </w:pPr>
+            <w:r>
+              <w:rPr>
+                <w:b w:val="false"/>
+                <w:bCs w:val="false"/>
+                <w:sz w:val="18"/>
+                <w:szCs w:val="18"/>
+              </w:rPr>
+              <w:t xml:space="preserve">63</w:t>
+            </w:r>
+          </w:p>
+        </w:tc>
+        <w:tc>
+          <w:tcPr>
+            <w:tcW w:type="dxa" w:w="0"/>
+            <w:tcMar>
+              <w:top w:type="dxa" w:w="60"/>
+              <w:left w:type="dxa" w:w="80"/>
+              <w:bottom w:type="dxa" w:w="60"/>
+              <w:right w:type="dxa" w:w="80"/>
+            </w:tcMar>
+          </w:tcPr>
+          <w:p>
+            <w:pPr>
+              <w:spacing w:after="0"/>
+            </w:pPr>
+            <w:r>
+              <w:rPr>
+                <w:b w:val="false"/>
+                <w:bCs w:val="false"/>
+                <w:sz w:val="18"/>
+                <w:szCs w:val="18"/>
+              </w:rPr>
+              <w:t xml:space="preserve">Detection test</w:t>
+            </w:r>
+          </w:p>
+        </w:tc>
+        <w:tc>
+          <w:tcPr>
+            <w:tcW w:type="dxa" w:w="0"/>
+            <w:tcMar>
+              <w:top w:type="dxa" w:w="60"/>
+              <w:left w:type="dxa" w:w="80"/>
+              <w:bottom w:type="dxa" w:w="60"/>
+              <w:right w:type="dxa" w:w="80"/>
+            </w:tcMar>
+          </w:tcPr>
+          <w:p>
+            <w:pPr>
+              <w:spacing w:after="0"/>
+            </w:pPr>
+            <w:r>
+              <w:rPr>
+                <w:b w:val="false"/>
+                <w:bCs w:val="false"/>
+                <w:sz w:val="18"/>
+                <w:szCs w:val="18"/>
+              </w:rPr>
+              <w:t xml:space="preserve">The Linux EICAR test (MDE-3) finds </w:t>
+            </w:r>
+            <w:r>
+              <w:rPr>
+                <w:rFonts w:ascii="Consolas" w:cs="Consolas" w:eastAsia="Consolas" w:hAnsi="Consolas"/>
+                <w:b w:val="false"/>
+                <w:bCs w:val="false"/>
+                <w:sz w:val="18"/>
+                <w:szCs w:val="18"/>
+              </w:rPr>
+              <w:t xml:space="preserve">Virus:DOS/EICAR_Test_File</w:t>
+            </w:r>
+            <w:r>
+              <w:rPr>
+                <w:b w:val="false"/>
+                <w:bCs w:val="false"/>
+                <w:sz w:val="18"/>
+                <w:szCs w:val="18"/>
+              </w:rPr>
+              <w:t xml:space="preserve">, but the file is still there afterwards and the test stays </w:t>
+            </w:r>
+            <w:r>
+              <w:rPr>
+                <w:b w:val="false"/>
+                <w:bCs w:val="false"/>
+                <w:i/>
+                <w:iCs/>
+                <w:sz w:val="18"/>
+                <w:szCs w:val="18"/>
+              </w:rPr>
+              <w:t xml:space="preserve">pending</w:t>
+            </w:r>
+            <w:r>
+              <w:rPr>
+                <w:b w:val="false"/>
+                <w:bCs w:val="false"/>
+                <w:sz w:val="18"/>
+                <w:szCs w:val="18"/>
+              </w:rPr>
+              <w:t xml:space="preserve"> (no Defender alert or incident)</w:t>
+            </w:r>
+          </w:p>
+        </w:tc>
+        <w:tc>
+          <w:tcPr>
+            <w:tcW w:type="dxa" w:w="0"/>
+            <w:tcMar>
+              <w:top w:type="dxa" w:w="60"/>
+              <w:left w:type="dxa" w:w="80"/>
+              <w:bottom w:type="dxa" w:w="60"/>
+              <w:right w:type="dxa" w:w="80"/>
+            </w:tcMar>
+          </w:tcPr>
+          <w:p>
+            <w:pPr>
+              <w:spacing w:after="0"/>
+            </w:pPr>
+            <w:r>
+              <w:rPr>
+                <w:b w:val="false"/>
+                <w:bCs w:val="false"/>
+                <w:sz w:val="18"/>
+                <w:szCs w:val="18"/>
+              </w:rPr>
+              <w:t xml:space="preserve">On the test lab </w:t>
+            </w:r>
+            <w:r>
+              <w:rPr>
+                <w:rFonts w:ascii="Consolas" w:cs="Consolas" w:eastAsia="Consolas" w:hAnsi="Consolas"/>
+                <w:b w:val="false"/>
+                <w:bCs w:val="false"/>
+                <w:sz w:val="18"/>
+                <w:szCs w:val="18"/>
+              </w:rPr>
+              <w:t xml:space="preserve">mdatp health</w:t>
+            </w:r>
+            <w:r>
+              <w:rPr>
+                <w:b w:val="false"/>
+                <w:bCs w:val="false"/>
+                <w:sz w:val="18"/>
+                <w:szCs w:val="18"/>
+              </w:rPr>
+              <w:t xml:space="preserve"> reported real-time protection </w:t>
+            </w:r>
+            <w:r>
+              <w:rPr>
+                <w:b w:val="false"/>
+                <w:bCs w:val="false"/>
+                <w:sz w:val="18"/>
+                <w:szCs w:val="18"/>
+              </w:rPr>
+              <w:t xml:space="preserve">off</w:t>
+            </w:r>
+            <w:r>
+              <w:rPr>
+                <w:b w:val="false"/>
+                <w:bCs w:val="false"/>
+                <w:sz w:val="18"/>
+                <w:szCs w:val="18"/>
+              </w:rPr>
+              <w:t xml:space="preserve"> on the Linux servers onboarded through Defender for Servers: an on-demand scan detects and reports, nothing removes the file</w:t>
+            </w:r>
+          </w:p>
+        </w:tc>
+        <w:tc>
+          <w:tcPr>
+            <w:tcW w:type="dxa" w:w="0"/>
+            <w:tcMar>
+              <w:top w:type="dxa" w:w="60"/>
+              <w:left w:type="dxa" w:w="80"/>
+              <w:bottom w:type="dxa" w:w="60"/>
+              <w:right w:type="dxa" w:w="80"/>
+            </w:tcMar>
+          </w:tcPr>
+          <w:p>
+            <w:pPr>
+              <w:spacing w:after="0"/>
+            </w:pPr>
+            <w:r>
+              <w:rPr>
+                <w:b w:val="false"/>
+                <w:bCs w:val="false"/>
+                <w:sz w:val="18"/>
+                <w:szCs w:val="18"/>
+              </w:rPr>
+              <w:t xml:space="preserve">Expected with that setting. The script deletes the test file itself. Switch Linux devices to active mode in the Defender portal or with </w:t>
+            </w:r>
+            <w:r>
+              <w:rPr>
+                <w:rFonts w:ascii="Consolas" w:cs="Consolas" w:eastAsia="Consolas" w:hAnsi="Consolas"/>
+                <w:b w:val="false"/>
+                <w:bCs w:val="false"/>
+                <w:sz w:val="18"/>
+                <w:szCs w:val="18"/>
+              </w:rPr>
+              <w:t xml:space="preserve">mdatp config real-time-protection --value enabled</w:t>
+            </w:r>
+            <w:r>
+              <w:rPr>
+                <w:b w:val="false"/>
+                <w:bCs w:val="false"/>
+                <w:sz w:val="18"/>
+                <w:szCs w:val="18"/>
+              </w:rPr>
+              <w:t xml:space="preserve"> if you want blocking</w:t>
             </w:r>
           </w:p>
         </w:tc>

</xml_diff>